<commit_message>
Add equal-weight composite ranking of five measures
Standardised, equally weighted average of rule adherence, WASSA, emotion
validation, judge empathy and freedom from boilerplate across all judged
systems: final system second of eight behind the 7.6B single model, first
among systems within the 8 GB budget, and second or third under any
leave-one-measure-out check. Full table in the thesis (5.2.6, Table 5.30),
two summary sentences in the paper.

Co-Authored-By: Claude Opus 5 (1M context) <noreply@anthropic.com>
</commit_message>
<xml_diff>
--- a/writing/Chapter 5 - 5.2 Analysis of Design Solutions/FINAL_TEXT.docx
+++ b/writing/Chapter 5 - 5.2 Analysis of Design Solutions/FINAL_TEXT.docx
@@ -1835,6 +1835,1016 @@
     </w:p>
     <w:p>
       <w:pPr>
+        <w:spacing w:after="120"/>
+      </w:pPr>
+      <w:r>
+        <w:t>Because the measures disagree with one another, Table 5.30 summarises them in a single ranking. Each of five independent measures, namely rule adherence, WASSA empathy, emotion validation, AI-judge empathy and freedom from boilerplate, is standardised across the systems and the five standardised values are averaged with equal weight. Nothing is tuned: the weights are equal, every judged system is included, and the measures are the ones already reported in Table 5.1.</w:t>
+      </w:r>
+    </w:p>
+    <w:p>
+      <w:pPr>
+        <w:spacing w:after="120"/>
+      </w:pPr>
+      <w:r>
+        <w:t xml:space="preserve">The final system ranks </w:t>
+      </w:r>
+      <w:r>
+        <w:rPr>
+          <w:b/>
+        </w:rPr>
+        <w:t>second of eight</w:t>
+      </w:r>
+      <w:r>
+        <w:t xml:space="preserve">, behind only the 7.6-billion-parameter single model, which requires 4.7 times as many parameters and 62% more GPU memory (Section 5.4.7). It is ahead of the single model built on its own generator (+0.50 against +0.09), of top-1 prompting with that generator (+0.04) and of the same-size single model (+0.06). </w:t>
+      </w:r>
+      <w:r>
+        <w:rPr>
+          <w:b/>
+        </w:rPr>
+        <w:t>Among the systems that fit the 8 GB budget set as an objective in Section 4.1.1, the final system ranks first.</w:t>
+      </w:r>
+      <w:r>
+        <w:t xml:space="preserve"> The ranking is not an artefact of one favourable measure: removing any single measure leaves the final system in second or third place, always behind the larger single model.</w:t>
+      </w:r>
+    </w:p>
+    <w:p>
+      <w:pPr>
+        <w:spacing w:after="120"/>
+      </w:pPr>
+      <w:r>
+        <w:t>A composite of this kind depends on which measures are included, so it is reported as a summary of the per-measure results rather than as evidence in its own right. The per-measure comparisons in Sections 5.3.2 and 5.4.9, with their significance tests, remain the basis for the conclusions of this thesis.</w:t>
+      </w:r>
+    </w:p>
+    <w:tbl>
+      <w:tblPr>
+        <w:tblStyle w:val="TableGrid"/>
+        <w:tblW w:type="auto" w:w="0"/>
+        <w:tblLook w:firstColumn="1" w:firstRow="1" w:lastColumn="0" w:lastRow="0" w:noHBand="0" w:noVBand="1" w:val="04A0"/>
+      </w:tblPr>
+      <w:tblGrid>
+        <w:gridCol w:w="1337"/>
+        <w:gridCol w:w="1337"/>
+        <w:gridCol w:w="1337"/>
+        <w:gridCol w:w="1337"/>
+        <w:gridCol w:w="1337"/>
+        <w:gridCol w:w="1337"/>
+        <w:gridCol w:w="1337"/>
+      </w:tblGrid>
+      <w:tr>
+        <w:tc>
+          <w:tcPr>
+            <w:tcW w:type="dxa" w:w="1337"/>
+            <w:shd w:val="clear" w:color="auto" w:fill="E3EEFB"/>
+          </w:tcPr>
+          <w:p>
+            <w:r>
+              <w:rPr>
+                <w:b/>
+              </w:rPr>
+            </w:r>
+            <w:r>
+              <w:rPr>
+                <w:b/>
+                <w:sz w:val="13"/>
+              </w:rPr>
+              <w:t>System</w:t>
+            </w:r>
+          </w:p>
+        </w:tc>
+        <w:tc>
+          <w:tcPr>
+            <w:tcW w:type="dxa" w:w="1337"/>
+            <w:shd w:val="clear" w:color="auto" w:fill="E3EEFB"/>
+          </w:tcPr>
+          <w:p>
+            <w:r>
+              <w:rPr>
+                <w:b/>
+              </w:rPr>
+            </w:r>
+            <w:r>
+              <w:rPr>
+                <w:b/>
+                <w:sz w:val="13"/>
+              </w:rPr>
+              <w:t>All rules (%)</w:t>
+            </w:r>
+          </w:p>
+        </w:tc>
+        <w:tc>
+          <w:tcPr>
+            <w:tcW w:type="dxa" w:w="1337"/>
+            <w:shd w:val="clear" w:color="auto" w:fill="E3EEFB"/>
+          </w:tcPr>
+          <w:p>
+            <w:r>
+              <w:rPr>
+                <w:b/>
+              </w:rPr>
+            </w:r>
+            <w:r>
+              <w:rPr>
+                <w:b/>
+                <w:sz w:val="13"/>
+              </w:rPr>
+              <w:t>WASSA empathy</w:t>
+            </w:r>
+          </w:p>
+        </w:tc>
+        <w:tc>
+          <w:tcPr>
+            <w:tcW w:type="dxa" w:w="1337"/>
+            <w:shd w:val="clear" w:color="auto" w:fill="E3EEFB"/>
+          </w:tcPr>
+          <w:p>
+            <w:r>
+              <w:rPr>
+                <w:b/>
+              </w:rPr>
+            </w:r>
+            <w:r>
+              <w:rPr>
+                <w:b/>
+                <w:sz w:val="13"/>
+              </w:rPr>
+              <w:t>Emotion validation (%)</w:t>
+            </w:r>
+          </w:p>
+        </w:tc>
+        <w:tc>
+          <w:tcPr>
+            <w:tcW w:type="dxa" w:w="1337"/>
+            <w:shd w:val="clear" w:color="auto" w:fill="E3EEFB"/>
+          </w:tcPr>
+          <w:p>
+            <w:r>
+              <w:rPr>
+                <w:b/>
+              </w:rPr>
+            </w:r>
+            <w:r>
+              <w:rPr>
+                <w:b/>
+                <w:sz w:val="13"/>
+              </w:rPr>
+              <w:t>AI-judge empathy</w:t>
+            </w:r>
+          </w:p>
+        </w:tc>
+        <w:tc>
+          <w:tcPr>
+            <w:tcW w:type="dxa" w:w="1337"/>
+            <w:shd w:val="clear" w:color="auto" w:fill="E3EEFB"/>
+          </w:tcPr>
+          <w:p>
+            <w:r>
+              <w:rPr>
+                <w:b/>
+              </w:rPr>
+            </w:r>
+            <w:r>
+              <w:rPr>
+                <w:b/>
+                <w:sz w:val="13"/>
+              </w:rPr>
+              <w:t>Non-repetition (%)</w:t>
+            </w:r>
+          </w:p>
+        </w:tc>
+        <w:tc>
+          <w:tcPr>
+            <w:tcW w:type="dxa" w:w="1337"/>
+            <w:shd w:val="clear" w:color="auto" w:fill="E3EEFB"/>
+          </w:tcPr>
+          <w:p>
+            <w:r>
+              <w:rPr>
+                <w:b/>
+              </w:rPr>
+            </w:r>
+            <w:r>
+              <w:rPr>
+                <w:b/>
+                <w:sz w:val="13"/>
+              </w:rPr>
+              <w:t>Composite (equal weights)</w:t>
+            </w:r>
+          </w:p>
+        </w:tc>
+      </w:tr>
+      <w:tr>
+        <w:tc>
+          <w:tcPr>
+            <w:tcW w:type="dxa" w:w="1337"/>
+          </w:tcPr>
+          <w:p>
+            <w:r/>
+            <w:r>
+              <w:rPr>
+                <w:sz w:val="13"/>
+              </w:rPr>
+              <w:t>Single model, bigger: Qwen2.5-7B (4-bit) detects + responds</w:t>
+            </w:r>
+          </w:p>
+        </w:tc>
+        <w:tc>
+          <w:tcPr>
+            <w:tcW w:type="dxa" w:w="1337"/>
+          </w:tcPr>
+          <w:p>
+            <w:r/>
+            <w:r>
+              <w:rPr>
+                <w:sz w:val="13"/>
+              </w:rPr>
+              <w:t>82.33</w:t>
+            </w:r>
+          </w:p>
+        </w:tc>
+        <w:tc>
+          <w:tcPr>
+            <w:tcW w:type="dxa" w:w="1337"/>
+          </w:tcPr>
+          <w:p>
+            <w:r/>
+            <w:r>
+              <w:rPr>
+                <w:sz w:val="13"/>
+              </w:rPr>
+              <w:t>5.76</w:t>
+            </w:r>
+          </w:p>
+        </w:tc>
+        <w:tc>
+          <w:tcPr>
+            <w:tcW w:type="dxa" w:w="1337"/>
+          </w:tcPr>
+          <w:p>
+            <w:r/>
+            <w:r>
+              <w:rPr>
+                <w:sz w:val="13"/>
+              </w:rPr>
+              <w:t>32.33</w:t>
+            </w:r>
+          </w:p>
+        </w:tc>
+        <w:tc>
+          <w:tcPr>
+            <w:tcW w:type="dxa" w:w="1337"/>
+          </w:tcPr>
+          <w:p>
+            <w:r/>
+            <w:r>
+              <w:rPr>
+                <w:sz w:val="13"/>
+              </w:rPr>
+              <w:t>8.15</w:t>
+            </w:r>
+          </w:p>
+        </w:tc>
+        <w:tc>
+          <w:tcPr>
+            <w:tcW w:type="dxa" w:w="1337"/>
+          </w:tcPr>
+          <w:p>
+            <w:r/>
+            <w:r>
+              <w:rPr>
+                <w:sz w:val="13"/>
+              </w:rPr>
+              <w:t>41.3</w:t>
+            </w:r>
+          </w:p>
+        </w:tc>
+        <w:tc>
+          <w:tcPr>
+            <w:tcW w:type="dxa" w:w="1337"/>
+          </w:tcPr>
+          <w:p>
+            <w:r/>
+            <w:r>
+              <w:rPr>
+                <w:sz w:val="13"/>
+              </w:rPr>
+              <w:t>0.79</w:t>
+            </w:r>
+          </w:p>
+        </w:tc>
+      </w:tr>
+      <w:tr>
+        <w:tc>
+          <w:tcPr>
+            <w:tcW w:type="dxa" w:w="1337"/>
+          </w:tcPr>
+          <w:p>
+            <w:r/>
+            <w:r>
+              <w:rPr>
+                <w:sz w:val="13"/>
+              </w:rPr>
+              <w:t>FINAL SYSTEM - Two-stage: RoBERTa top-3 -&gt; Phi-4-mini picks + per-emotion prompt</w:t>
+            </w:r>
+          </w:p>
+        </w:tc>
+        <w:tc>
+          <w:tcPr>
+            <w:tcW w:type="dxa" w:w="1337"/>
+          </w:tcPr>
+          <w:p>
+            <w:r/>
+            <w:r>
+              <w:rPr>
+                <w:sz w:val="13"/>
+              </w:rPr>
+              <w:t>60</w:t>
+            </w:r>
+          </w:p>
+        </w:tc>
+        <w:tc>
+          <w:tcPr>
+            <w:tcW w:type="dxa" w:w="1337"/>
+          </w:tcPr>
+          <w:p>
+            <w:r/>
+            <w:r>
+              <w:rPr>
+                <w:sz w:val="13"/>
+              </w:rPr>
+              <w:t>5.05</w:t>
+            </w:r>
+          </w:p>
+        </w:tc>
+        <w:tc>
+          <w:tcPr>
+            <w:tcW w:type="dxa" w:w="1337"/>
+          </w:tcPr>
+          <w:p>
+            <w:r/>
+            <w:r>
+              <w:rPr>
+                <w:sz w:val="13"/>
+              </w:rPr>
+              <w:t>36.67</w:t>
+            </w:r>
+          </w:p>
+        </w:tc>
+        <w:tc>
+          <w:tcPr>
+            <w:tcW w:type="dxa" w:w="1337"/>
+          </w:tcPr>
+          <w:p>
+            <w:r/>
+            <w:r>
+              <w:rPr>
+                <w:sz w:val="13"/>
+              </w:rPr>
+              <w:t>7.84</w:t>
+            </w:r>
+          </w:p>
+        </w:tc>
+        <w:tc>
+          <w:tcPr>
+            <w:tcW w:type="dxa" w:w="1337"/>
+          </w:tcPr>
+          <w:p>
+            <w:r/>
+            <w:r>
+              <w:rPr>
+                <w:sz w:val="13"/>
+              </w:rPr>
+              <w:t>41.3</w:t>
+            </w:r>
+          </w:p>
+        </w:tc>
+        <w:tc>
+          <w:tcPr>
+            <w:tcW w:type="dxa" w:w="1337"/>
+          </w:tcPr>
+          <w:p>
+            <w:r/>
+            <w:r>
+              <w:rPr>
+                <w:sz w:val="13"/>
+              </w:rPr>
+              <w:t>0.5</w:t>
+            </w:r>
+          </w:p>
+        </w:tc>
+      </w:tr>
+      <w:tr>
+        <w:tc>
+          <w:tcPr>
+            <w:tcW w:type="dxa" w:w="1337"/>
+          </w:tcPr>
+          <w:p>
+            <w:r/>
+            <w:r>
+              <w:rPr>
+                <w:sz w:val="13"/>
+              </w:rPr>
+              <w:t>Initial pipeline: GPT-2 Medium d1 + Qwen2.5-1.5B d2</w:t>
+            </w:r>
+          </w:p>
+        </w:tc>
+        <w:tc>
+          <w:tcPr>
+            <w:tcW w:type="dxa" w:w="1337"/>
+          </w:tcPr>
+          <w:p>
+            <w:r/>
+            <w:r>
+              <w:rPr>
+                <w:sz w:val="13"/>
+              </w:rPr>
+              <w:t>63.67</w:t>
+            </w:r>
+          </w:p>
+        </w:tc>
+        <w:tc>
+          <w:tcPr>
+            <w:tcW w:type="dxa" w:w="1337"/>
+          </w:tcPr>
+          <w:p>
+            <w:r/>
+            <w:r>
+              <w:rPr>
+                <w:sz w:val="13"/>
+              </w:rPr>
+              <w:t>4.8</w:t>
+            </w:r>
+          </w:p>
+        </w:tc>
+        <w:tc>
+          <w:tcPr>
+            <w:tcW w:type="dxa" w:w="1337"/>
+          </w:tcPr>
+          <w:p>
+            <w:r/>
+            <w:r>
+              <w:rPr>
+                <w:sz w:val="13"/>
+              </w:rPr>
+              <w:t>26</w:t>
+            </w:r>
+          </w:p>
+        </w:tc>
+        <w:tc>
+          <w:tcPr>
+            <w:tcW w:type="dxa" w:w="1337"/>
+          </w:tcPr>
+          <w:p>
+            <w:r/>
+            <w:r>
+              <w:rPr>
+                <w:sz w:val="13"/>
+              </w:rPr>
+              <w:t>6.98</w:t>
+            </w:r>
+          </w:p>
+        </w:tc>
+        <w:tc>
+          <w:tcPr>
+            <w:tcW w:type="dxa" w:w="1337"/>
+          </w:tcPr>
+          <w:p>
+            <w:r/>
+            <w:r>
+              <w:rPr>
+                <w:sz w:val="13"/>
+              </w:rPr>
+              <w:t>76.3</w:t>
+            </w:r>
+          </w:p>
+        </w:tc>
+        <w:tc>
+          <w:tcPr>
+            <w:tcW w:type="dxa" w:w="1337"/>
+          </w:tcPr>
+          <w:p>
+            <w:r/>
+            <w:r>
+              <w:rPr>
+                <w:sz w:val="13"/>
+              </w:rPr>
+              <w:t>0.24</w:t>
+            </w:r>
+          </w:p>
+        </w:tc>
+      </w:tr>
+      <w:tr>
+        <w:tc>
+          <w:tcPr>
+            <w:tcW w:type="dxa" w:w="1337"/>
+          </w:tcPr>
+          <w:p>
+            <w:r/>
+            <w:r>
+              <w:rPr>
+                <w:sz w:val="13"/>
+              </w:rPr>
+              <w:t>Single model, same generator: Phi-4-mini (4-bit) detects + responds</w:t>
+            </w:r>
+          </w:p>
+        </w:tc>
+        <w:tc>
+          <w:tcPr>
+            <w:tcW w:type="dxa" w:w="1337"/>
+          </w:tcPr>
+          <w:p>
+            <w:r/>
+            <w:r>
+              <w:rPr>
+                <w:sz w:val="13"/>
+              </w:rPr>
+              <w:t>73.67</w:t>
+            </w:r>
+          </w:p>
+        </w:tc>
+        <w:tc>
+          <w:tcPr>
+            <w:tcW w:type="dxa" w:w="1337"/>
+          </w:tcPr>
+          <w:p>
+            <w:r/>
+            <w:r>
+              <w:rPr>
+                <w:sz w:val="13"/>
+              </w:rPr>
+              <w:t>4.75</w:t>
+            </w:r>
+          </w:p>
+        </w:tc>
+        <w:tc>
+          <w:tcPr>
+            <w:tcW w:type="dxa" w:w="1337"/>
+          </w:tcPr>
+          <w:p>
+            <w:r/>
+            <w:r>
+              <w:rPr>
+                <w:sz w:val="13"/>
+              </w:rPr>
+              <w:t>27</w:t>
+            </w:r>
+          </w:p>
+        </w:tc>
+        <w:tc>
+          <w:tcPr>
+            <w:tcW w:type="dxa" w:w="1337"/>
+          </w:tcPr>
+          <w:p>
+            <w:r/>
+            <w:r>
+              <w:rPr>
+                <w:sz w:val="13"/>
+              </w:rPr>
+              <w:t>8.04</w:t>
+            </w:r>
+          </w:p>
+        </w:tc>
+        <w:tc>
+          <w:tcPr>
+            <w:tcW w:type="dxa" w:w="1337"/>
+          </w:tcPr>
+          <w:p>
+            <w:r/>
+            <w:r>
+              <w:rPr>
+                <w:sz w:val="13"/>
+              </w:rPr>
+              <w:t>27.7</w:t>
+            </w:r>
+          </w:p>
+        </w:tc>
+        <w:tc>
+          <w:tcPr>
+            <w:tcW w:type="dxa" w:w="1337"/>
+          </w:tcPr>
+          <w:p>
+            <w:r/>
+            <w:r>
+              <w:rPr>
+                <w:sz w:val="13"/>
+              </w:rPr>
+              <w:t>0.09</w:t>
+            </w:r>
+          </w:p>
+        </w:tc>
+      </w:tr>
+      <w:tr>
+        <w:tc>
+          <w:tcPr>
+            <w:tcW w:type="dxa" w:w="1337"/>
+          </w:tcPr>
+          <w:p>
+            <w:r/>
+            <w:r>
+              <w:rPr>
+                <w:sz w:val="13"/>
+              </w:rPr>
+              <w:t>Single model, same size: Qwen2.5-1.5B detects + responds</w:t>
+            </w:r>
+          </w:p>
+        </w:tc>
+        <w:tc>
+          <w:tcPr>
+            <w:tcW w:type="dxa" w:w="1337"/>
+          </w:tcPr>
+          <w:p>
+            <w:r/>
+            <w:r>
+              <w:rPr>
+                <w:sz w:val="13"/>
+              </w:rPr>
+              <w:t>51.33</w:t>
+            </w:r>
+          </w:p>
+        </w:tc>
+        <w:tc>
+          <w:tcPr>
+            <w:tcW w:type="dxa" w:w="1337"/>
+          </w:tcPr>
+          <w:p>
+            <w:r/>
+            <w:r>
+              <w:rPr>
+                <w:sz w:val="13"/>
+              </w:rPr>
+              <w:t>4.84</w:t>
+            </w:r>
+          </w:p>
+        </w:tc>
+        <w:tc>
+          <w:tcPr>
+            <w:tcW w:type="dxa" w:w="1337"/>
+          </w:tcPr>
+          <w:p>
+            <w:r/>
+            <w:r>
+              <w:rPr>
+                <w:sz w:val="13"/>
+              </w:rPr>
+              <w:t>25.67</w:t>
+            </w:r>
+          </w:p>
+        </w:tc>
+        <w:tc>
+          <w:tcPr>
+            <w:tcW w:type="dxa" w:w="1337"/>
+          </w:tcPr>
+          <w:p>
+            <w:r/>
+            <w:r>
+              <w:rPr>
+                <w:sz w:val="13"/>
+              </w:rPr>
+              <w:t>7.15</w:t>
+            </w:r>
+          </w:p>
+        </w:tc>
+        <w:tc>
+          <w:tcPr>
+            <w:tcW w:type="dxa" w:w="1337"/>
+          </w:tcPr>
+          <w:p>
+            <w:r/>
+            <w:r>
+              <w:rPr>
+                <w:sz w:val="13"/>
+              </w:rPr>
+              <w:t>65</w:t>
+            </w:r>
+          </w:p>
+        </w:tc>
+        <w:tc>
+          <w:tcPr>
+            <w:tcW w:type="dxa" w:w="1337"/>
+          </w:tcPr>
+          <w:p>
+            <w:r/>
+            <w:r>
+              <w:rPr>
+                <w:sz w:val="13"/>
+              </w:rPr>
+              <w:t>0.06</w:t>
+            </w:r>
+          </w:p>
+        </w:tc>
+      </w:tr>
+      <w:tr>
+        <w:tc>
+          <w:tcPr>
+            <w:tcW w:type="dxa" w:w="1337"/>
+          </w:tcPr>
+          <w:p>
+            <w:r/>
+            <w:r>
+              <w:rPr>
+                <w:sz w:val="13"/>
+              </w:rPr>
+              <w:t>RoBERTa d1 + Phi-4-mini d2 (top-1 emotion)</w:t>
+            </w:r>
+          </w:p>
+        </w:tc>
+        <w:tc>
+          <w:tcPr>
+            <w:tcW w:type="dxa" w:w="1337"/>
+          </w:tcPr>
+          <w:p>
+            <w:r/>
+            <w:r>
+              <w:rPr>
+                <w:sz w:val="13"/>
+              </w:rPr>
+              <w:t>65.33</w:t>
+            </w:r>
+          </w:p>
+        </w:tc>
+        <w:tc>
+          <w:tcPr>
+            <w:tcW w:type="dxa" w:w="1337"/>
+          </w:tcPr>
+          <w:p>
+            <w:r/>
+            <w:r>
+              <w:rPr>
+                <w:sz w:val="13"/>
+              </w:rPr>
+              <w:t>4.89</w:t>
+            </w:r>
+          </w:p>
+        </w:tc>
+        <w:tc>
+          <w:tcPr>
+            <w:tcW w:type="dxa" w:w="1337"/>
+          </w:tcPr>
+          <w:p>
+            <w:r/>
+            <w:r>
+              <w:rPr>
+                <w:sz w:val="13"/>
+              </w:rPr>
+              <w:t>28.33</w:t>
+            </w:r>
+          </w:p>
+        </w:tc>
+        <w:tc>
+          <w:tcPr>
+            <w:tcW w:type="dxa" w:w="1337"/>
+          </w:tcPr>
+          <w:p>
+            <w:r/>
+            <w:r>
+              <w:rPr>
+                <w:sz w:val="13"/>
+              </w:rPr>
+              <w:t>7.84</w:t>
+            </w:r>
+          </w:p>
+        </w:tc>
+        <w:tc>
+          <w:tcPr>
+            <w:tcW w:type="dxa" w:w="1337"/>
+          </w:tcPr>
+          <w:p>
+            <w:r/>
+            <w:r>
+              <w:rPr>
+                <w:sz w:val="13"/>
+              </w:rPr>
+              <w:t>23</w:t>
+            </w:r>
+          </w:p>
+        </w:tc>
+        <w:tc>
+          <w:tcPr>
+            <w:tcW w:type="dxa" w:w="1337"/>
+          </w:tcPr>
+          <w:p>
+            <w:r/>
+            <w:r>
+              <w:rPr>
+                <w:sz w:val="13"/>
+              </w:rPr>
+              <w:t>0.04</w:t>
+            </w:r>
+          </w:p>
+        </w:tc>
+      </w:tr>
+      <w:tr>
+        <w:tc>
+          <w:tcPr>
+            <w:tcW w:type="dxa" w:w="1337"/>
+          </w:tcPr>
+          <w:p>
+            <w:r/>
+            <w:r>
+              <w:rPr>
+                <w:sz w:val="13"/>
+              </w:rPr>
+              <w:t>Zero-shot Qwen2.5-1.5B (no detector, generic prompt)</w:t>
+            </w:r>
+          </w:p>
+        </w:tc>
+        <w:tc>
+          <w:tcPr>
+            <w:tcW w:type="dxa" w:w="1337"/>
+          </w:tcPr>
+          <w:p>
+            <w:r/>
+            <w:r>
+              <w:rPr>
+                <w:sz w:val="13"/>
+              </w:rPr>
+              <w:t>19</w:t>
+            </w:r>
+          </w:p>
+        </w:tc>
+        <w:tc>
+          <w:tcPr>
+            <w:tcW w:type="dxa" w:w="1337"/>
+          </w:tcPr>
+          <w:p>
+            <w:r/>
+            <w:r>
+              <w:rPr>
+                <w:sz w:val="13"/>
+              </w:rPr>
+              <w:t>4.25</w:t>
+            </w:r>
+          </w:p>
+        </w:tc>
+        <w:tc>
+          <w:tcPr>
+            <w:tcW w:type="dxa" w:w="1337"/>
+          </w:tcPr>
+          <w:p>
+            <w:r/>
+            <w:r>
+              <w:rPr>
+                <w:sz w:val="13"/>
+              </w:rPr>
+              <w:t>24.67</w:t>
+            </w:r>
+          </w:p>
+        </w:tc>
+        <w:tc>
+          <w:tcPr>
+            <w:tcW w:type="dxa" w:w="1337"/>
+          </w:tcPr>
+          <w:p>
+            <w:r/>
+            <w:r>
+              <w:rPr>
+                <w:sz w:val="13"/>
+              </w:rPr>
+              <w:t>5.98</w:t>
+            </w:r>
+          </w:p>
+        </w:tc>
+        <w:tc>
+          <w:tcPr>
+            <w:tcW w:type="dxa" w:w="1337"/>
+          </w:tcPr>
+          <w:p>
+            <w:r/>
+            <w:r>
+              <w:rPr>
+                <w:sz w:val="13"/>
+              </w:rPr>
+              <w:t>65.3</w:t>
+            </w:r>
+          </w:p>
+        </w:tc>
+        <w:tc>
+          <w:tcPr>
+            <w:tcW w:type="dxa" w:w="1337"/>
+          </w:tcPr>
+          <w:p>
+            <w:r/>
+            <w:r>
+              <w:rPr>
+                <w:sz w:val="13"/>
+              </w:rPr>
+              <w:t>-0.59</w:t>
+            </w:r>
+          </w:p>
+        </w:tc>
+      </w:tr>
+      <w:tr>
+        <w:tc>
+          <w:tcPr>
+            <w:tcW w:type="dxa" w:w="1337"/>
+          </w:tcPr>
+          <w:p>
+            <w:r/>
+            <w:r>
+              <w:rPr>
+                <w:sz w:val="13"/>
+              </w:rPr>
+              <w:t>Monolithic LoRA fine-tuned Qwen2.5-1.5B (no detector)</w:t>
+            </w:r>
+          </w:p>
+        </w:tc>
+        <w:tc>
+          <w:tcPr>
+            <w:tcW w:type="dxa" w:w="1337"/>
+          </w:tcPr>
+          <w:p>
+            <w:r/>
+            <w:r>
+              <w:rPr>
+                <w:sz w:val="13"/>
+              </w:rPr>
+              <w:t>22.33</w:t>
+            </w:r>
+          </w:p>
+        </w:tc>
+        <w:tc>
+          <w:tcPr>
+            <w:tcW w:type="dxa" w:w="1337"/>
+          </w:tcPr>
+          <w:p>
+            <w:r/>
+            <w:r>
+              <w:rPr>
+                <w:sz w:val="13"/>
+              </w:rPr>
+              <w:t>3.36</w:t>
+            </w:r>
+          </w:p>
+        </w:tc>
+        <w:tc>
+          <w:tcPr>
+            <w:tcW w:type="dxa" w:w="1337"/>
+          </w:tcPr>
+          <w:p>
+            <w:r/>
+            <w:r>
+              <w:rPr>
+                <w:sz w:val="13"/>
+              </w:rPr>
+              <w:t>18.33</w:t>
+            </w:r>
+          </w:p>
+        </w:tc>
+        <w:tc>
+          <w:tcPr>
+            <w:tcW w:type="dxa" w:w="1337"/>
+          </w:tcPr>
+          <w:p>
+            <w:r/>
+            <w:r>
+              <w:rPr>
+                <w:sz w:val="13"/>
+              </w:rPr>
+              <w:t>3.88</w:t>
+            </w:r>
+          </w:p>
+        </w:tc>
+        <w:tc>
+          <w:tcPr>
+            <w:tcW w:type="dxa" w:w="1337"/>
+          </w:tcPr>
+          <w:p>
+            <w:r/>
+            <w:r>
+              <w:rPr>
+                <w:sz w:val="13"/>
+              </w:rPr>
+              <w:t>90.3</w:t>
+            </w:r>
+          </w:p>
+        </w:tc>
+        <w:tc>
+          <w:tcPr>
+            <w:tcW w:type="dxa" w:w="1337"/>
+          </w:tcPr>
+          <w:p>
+            <w:r/>
+            <w:r>
+              <w:rPr>
+                <w:sz w:val="13"/>
+              </w:rPr>
+              <w:t>-1.13</w:t>
+            </w:r>
+          </w:p>
+        </w:tc>
+      </w:tr>
+    </w:tbl>
+    <w:p/>
+    <w:p>
+      <w:r>
+        <w:rPr>
+          <w:i/>
+          <w:sz w:val="20"/>
+        </w:rPr>
+        <w:t>Table 5.30: Equal-weight composite of five independent measures across the judged systems</w:t>
+      </w:r>
+    </w:p>
+    <w:p>
+      <w:pPr>
         <w:pStyle w:val="Heading1"/>
       </w:pPr>
       <w:r>

</xml_diff>